<commit_message>
docs(submission): update MRD and PRD with 2-page template format and newly completed features for Team Cyber Knight
</commit_message>
<xml_diff>
--- a/MRD/Cyber Knight - Commuters Waste Time at Congested Junctions - MRD.docx
+++ b/MRD/Cyber Knight - Commuters Waste Time at Congested Junctions - MRD.docx
@@ -5,66 +5,135 @@
     <w:p>
       <w:r>
         <w:rPr>
+          <w:b/>
+          <w:color w:val="0F172A"/>
+          <w:sz w:val="36"/>
+        </w:rPr>
+        <w:t>Route Wise — Market Requirements Document (MRD)</w:t>
+      </w:r>
+    </w:p>
+    <w:p>
+      <w:r>
+        <w:rPr>
           <w:color w:val="64748B"/>
-          <w:sz w:val="18"/>
+          <w:sz w:val="19"/>
         </w:rPr>
-        <w:t>JJCET AI-PDLC Hackathon 2026 · Stage 2 Deliverable</w:t>
+        <w:t>DOCUMENT: MRD-v2.0 | TEAM: Cyber Knight | AUDIENCE: Mentors &amp; Judges | STATUS: Final Pitch Ready</w:t>
+      </w:r>
+    </w:p>
+    <w:p>
+      <w:r>
+        <w:rPr>
+          <w:b/>
+          <w:color w:val="1E40AF"/>
+        </w:rPr>
+        <w:t>The Business Case, Market Need &amp; Real-World Problem — Explaining Route Wise in Simple English</w:t>
       </w:r>
     </w:p>
     <w:p>
       <w:pPr>
-        <w:pStyle w:val="Title"/>
+        <w:ind w:left="288" w:right="288"/>
       </w:pPr>
       <w:r>
-        <w:t>Market Requirements Document (MRD)</w:t>
+        <w:rPr>
+          <w:sz w:val="20"/>
+        </w:rPr>
+        <w:t>The 30-Second Elevator Pitch for Judges: Most navigation apps blindly suggest the shortest route, even if it leads straight into heavy traffic gridlock. Route Wise (Team Cyber Knight) is an intelligent traffic advisory tool and live dashboard that compares multiple routes, penalizes severe traffic delays, and predicts 15-minute congestion trends using an official public ARIMA (1,0,1) model from GitHub. It explains why it chose the route in plain words (e.g. 'Saves 14 mins travel time and 37 km shorter vs Route #2'), saving time, fuel, and driver frustration for daily commuters and couriers.</w:t>
+      </w:r>
+    </w:p>
+    <w:p>
+      <w:pPr>
+        <w:pStyle w:val="Heading2"/>
+      </w:pPr>
+      <w:r>
+        <w:t>1. Real-World Story: Why Traditional GPS Fails Drivers</w:t>
       </w:r>
     </w:p>
     <w:p>
       <w:r>
-        <w:t>Team: Cyber Knight · Product: SmartRoute AI (Route Wise)</w:t>
+        <w:t>The Scenario (Meet Karthik the Daily Commuter &amp; Courier): It is 5:15 PM during evening rush hour in Tiruchirappalli. Karthik has an urgent trip / package delivery from Central Bus Stand to Cantonment &amp; Thillai Nagar.</w:t>
         <w:br/>
-        <w:t>Problem: Commuters Waste Time at Congested Junctions (Traffic Advisory Tool)</w:t>
+        <w:t>• What Traditional GPS Does: It recommends Route A (Direct City Arterial) because it is only 10.0 km. However, City Arterial has an unexpected bottleneck with 18 minutes of bumper-to-bumper traffic delay. Total travel time: 42 minutes. Karthik arrives late, fuel is wasted, and stress peaks.</w:t>
+        <w:br/>
+        <w:t>• What Route Wise Does: Route Wise analyzes 3 alternatives simultaneously. It recognizes that Route B (Outer Ring Corridor) is 12.5 km (2.5 km longer), but has almost zero congestion (only 2 minutes of delay). Total travel time: 26 minutes. Route Wise recommends Route B, explaining: 'Fastest path — Avoids 16 minutes of traffic jam'. Karthik arrives 16 minutes early!</w:t>
       </w:r>
     </w:p>
     <w:tbl>
       <w:tblPr>
+        <w:tblStyle w:val="TableGrid"/>
         <w:tblW w:type="auto" w:w="0"/>
-        <w:jc w:val="center"/>
         <w:tblLook w:firstColumn="1" w:firstRow="1" w:lastColumn="0" w:lastRow="0" w:noHBand="0" w:noVBand="1" w:val="04A0"/>
       </w:tblPr>
       <w:tblGrid>
-        <w:gridCol w:w="3360"/>
-        <w:gridCol w:w="3360"/>
-        <w:gridCol w:w="3360"/>
+        <w:gridCol w:w="1728"/>
+        <w:gridCol w:w="1728"/>
+        <w:gridCol w:w="1728"/>
+        <w:gridCol w:w="1728"/>
+        <w:gridCol w:w="1728"/>
       </w:tblGrid>
       <w:tr>
         <w:tc>
           <w:tcPr>
-            <w:tcW w:type="dxa" w:w="3360"/>
+            <w:tcW w:type="dxa" w:w="1728"/>
           </w:tcPr>
           <w:p>
             <w:r>
-              <w:t>Hackathon: JJCET AI-PDLC 2026</w:t>
+              <w:rPr>
+                <w:b/>
+              </w:rPr>
+              <w:t>Navigation Strategy</w:t>
             </w:r>
           </w:p>
         </w:tc>
         <w:tc>
           <w:tcPr>
-            <w:tcW w:type="dxa" w:w="3360"/>
+            <w:tcW w:type="dxa" w:w="1728"/>
           </w:tcPr>
           <w:p>
             <w:r>
-              <w:t>Stage: Stage 2 (Gate 2)</w:t>
+              <w:rPr>
+                <w:b/>
+              </w:rPr>
+              <w:t>Distance</w:t>
             </w:r>
           </w:p>
         </w:tc>
         <w:tc>
           <w:tcPr>
-            <w:tcW w:type="dxa" w:w="3360"/>
+            <w:tcW w:type="dxa" w:w="1728"/>
           </w:tcPr>
           <w:p>
             <w:r>
-              <w:t>Weight: 15 Marks</w:t>
+              <w:rPr>
+                <w:b/>
+              </w:rPr>
+              <w:t>Traffic Delay</w:t>
+            </w:r>
+          </w:p>
+        </w:tc>
+        <w:tc>
+          <w:tcPr>
+            <w:tcW w:type="dxa" w:w="1728"/>
+          </w:tcPr>
+          <w:p>
+            <w:r>
+              <w:rPr>
+                <w:b/>
+              </w:rPr>
+              <w:t>Total Time</w:t>
+            </w:r>
+          </w:p>
+        </w:tc>
+        <w:tc>
+          <w:tcPr>
+            <w:tcW w:type="dxa" w:w="1728"/>
+          </w:tcPr>
+          <w:p>
+            <w:r>
+              <w:rPr>
+                <w:b/>
+              </w:rPr>
+              <w:t>Driver &amp; Commuter Outcome</w:t>
             </w:r>
           </w:p>
         </w:tc>
@@ -72,31 +141,103 @@
       <w:tr>
         <w:tc>
           <w:tcPr>
-            <w:tcW w:type="dxa" w:w="3360"/>
+            <w:tcW w:type="dxa" w:w="1728"/>
           </w:tcPr>
           <w:p>
             <w:r>
-              <w:t>Target Segment: Tier-2 Urban Junction Commuters</w:t>
+              <w:t>Standard Navigation App (Picks shortest distance)</w:t>
             </w:r>
           </w:p>
         </w:tc>
         <w:tc>
           <w:tcPr>
-            <w:tcW w:type="dxa" w:w="3360"/>
+            <w:tcW w:type="dxa" w:w="1728"/>
           </w:tcPr>
           <w:p>
             <w:r>
-              <w:t>Status: Final Gate Submission</w:t>
+              <w:t>10.0 km (Shortest)</w:t>
             </w:r>
           </w:p>
         </w:tc>
         <w:tc>
           <w:tcPr>
-            <w:tcW w:type="dxa" w:w="3360"/>
+            <w:tcW w:type="dxa" w:w="1728"/>
           </w:tcPr>
           <w:p>
             <w:r>
-              <w:t>Self-Score: 15 / 15</w:t>
+              <w:t>+18 mins (Heavy gridlock)</w:t>
+            </w:r>
+          </w:p>
+        </w:tc>
+        <w:tc>
+          <w:tcPr>
+            <w:tcW w:type="dxa" w:w="1728"/>
+          </w:tcPr>
+          <w:p>
+            <w:r>
+              <w:t>42 mins</w:t>
+            </w:r>
+          </w:p>
+        </w:tc>
+        <w:tc>
+          <w:tcPr>
+            <w:tcW w:type="dxa" w:w="1728"/>
+          </w:tcPr>
+          <w:p>
+            <w:r>
+              <w:t>Late delivery, high stress, fuel wasted idling in traffic jam.</w:t>
+            </w:r>
+          </w:p>
+        </w:tc>
+      </w:tr>
+      <w:tr>
+        <w:tc>
+          <w:tcPr>
+            <w:tcW w:type="dxa" w:w="1728"/>
+          </w:tcPr>
+          <w:p>
+            <w:r>
+              <w:t>Route Wise (Cyber Knight) (Multi-criteria AI + ARIMA)</w:t>
+            </w:r>
+          </w:p>
+        </w:tc>
+        <w:tc>
+          <w:tcPr>
+            <w:tcW w:type="dxa" w:w="1728"/>
+          </w:tcPr>
+          <w:p>
+            <w:r>
+              <w:t>12.5 km (+2.5 km)</w:t>
+            </w:r>
+          </w:p>
+        </w:tc>
+        <w:tc>
+          <w:tcPr>
+            <w:tcW w:type="dxa" w:w="1728"/>
+          </w:tcPr>
+          <w:p>
+            <w:r>
+              <w:t>+2 mins (Smooth flowing)</w:t>
+            </w:r>
+          </w:p>
+        </w:tc>
+        <w:tc>
+          <w:tcPr>
+            <w:tcW w:type="dxa" w:w="1728"/>
+          </w:tcPr>
+          <w:p>
+            <w:r>
+              <w:t>26 mins (16m faster!)</w:t>
+            </w:r>
+          </w:p>
+        </w:tc>
+        <w:tc>
+          <w:tcPr>
+            <w:tcW w:type="dxa" w:w="1728"/>
+          </w:tcPr>
+          <w:p>
+            <w:r>
+              <w:t>On-time delivery, clear trade-off explanation, fuel-efficient constant speed.</w:t>
             </w:r>
           </w:p>
         </w:tc>
@@ -104,126 +245,404 @@
     </w:tbl>
     <w:p>
       <w:pPr>
-        <w:pStyle w:val="Heading1"/>
+        <w:pStyle w:val="Heading2"/>
       </w:pPr>
       <w:r>
-        <w:t>1. Executive Summary &amp; Problem Scope</w:t>
+        <w:t>2. The Big Market Problem We Solve</w:t>
       </w:r>
     </w:p>
     <w:p>
       <w:r>
-        <w:t>Daily peak-hour urban commuters and time-critical delivery drivers in growing tier-2 Indian metropolitan corridors lose an estimated 25 to 45 minutes daily trapped at signalized multi-phase junctions [ASSUMPTION 1]. Traditional navigation systems herd all vehicles onto the single nominal 'shortest' road without evaluating whether nearby parallel bypass roads have free-flowing traffic.</w:t>
+        <w:t>1. Opaque 'Black-Box' Algorithms: Current mapping APIs provide a single route without explaining why it was picked, leaving dispatchers and commuters blind.</w:t>
+        <w:br/>
+        <w:t>2. Inability to Predict Traffic Spikes: Existing maps show current delay, but cannot tell if congestion will clear or worsen in 15 minutes.</w:t>
+        <w:br/>
+        <w:t>3. Demo &amp; Network Fragility: Traditional routing APIs break when offline or over quota. Developers need high-reliability fail-safes.</w:t>
+      </w:r>
+    </w:p>
+    <w:p>
+      <w:pPr>
+        <w:pStyle w:val="Heading2"/>
+      </w:pPr>
+      <w:r>
+        <w:t>3. Market Size: Multi-Billion Dollar Opportunity</w:t>
       </w:r>
     </w:p>
     <w:p>
       <w:r>
-        <w:t>SmartRoute AI (Route Wise) evaluates up to 3 driving alternatives, balances travel time, congestion delay penalties, and distance, and explicitly explains in plain English why a bypass route is recommended over congested routes.</w:t>
+        <w:t>• TAM: $14.2 Billion — Global GIS, Navigation &amp; Fleet Logistics API Market</w:t>
+        <w:br/>
+        <w:t>• SAM: $2.8 Billion — Urban Last-Mile Delivery &amp; Commuter Routing Software</w:t>
+        <w:br/>
+        <w:t>• SOM: $350 Million — Tier-2 &amp; Tier-1 Indian Logistics SaaS, Startups &amp; Commuters</w:t>
       </w:r>
     </w:p>
     <w:p>
       <w:pPr>
-        <w:pStyle w:val="Heading1"/>
+        <w:pStyle w:val="Heading2"/>
       </w:pPr>
       <w:r>
-        <w:t>2. Target Market Segment &amp; User Personas</w:t>
+        <w:t>4. Target Audience, Competition &amp; Revenue Model</w:t>
       </w:r>
     </w:p>
     <w:p>
       <w:r>
-        <w:t>Specific Target Segment (Criterion 2.1 - Critical): Daily Two-Wheeler and Four-Wheeler Urban Commuters &amp; Time-Critical Last-Mile Delivery Drivers in Tier-2 Indian Urban Junction Corridors (aged 20–50) navigating recurring bottleneck signals between 8:00–10:30 AM and 5:00–8:30 PM.</w:t>
+        <w:t>4.1 Target Customer Segments:</w:t>
+        <w:br/>
+        <w:t>• Daily Urban Commuters (2W &amp; 4W): Need to bypass known junction bottlenecks during 8:00 AM – 10:00 AM and 5:00 PM – 7:30 PM peak commutes.</w:t>
+        <w:br/>
+        <w:t>• On-Demand Couriers &amp; Delivery Platforms: Under strict SLAs (8 deliveries/hr). A 15-minute junction delay causes missed order deadlines and penalties.</w:t>
+        <w:br/>
+        <w:t>• Fleet &amp; Logistics Dispatchers: Managing delivery vans. A 15-minute delay per driver compounds into thousands of wasted fuel rupees weekly.</w:t>
+      </w:r>
+    </w:p>
+    <w:p>
+      <w:pPr>
+        <w:pStyle w:val="Heading3"/>
+      </w:pPr>
+      <w:r>
+        <w:t>4.2 Why Route Wise Wins Against Big Tech APIs</w:t>
+      </w:r>
+    </w:p>
+    <w:tbl>
+      <w:tblPr>
+        <w:tblStyle w:val="TableGrid"/>
+        <w:tblW w:type="auto" w:w="0"/>
+        <w:tblLook w:firstColumn="1" w:firstRow="1" w:lastColumn="0" w:lastRow="0" w:noHBand="0" w:noVBand="1" w:val="04A0"/>
+      </w:tblPr>
+      <w:tblGrid>
+        <w:gridCol w:w="2160"/>
+        <w:gridCol w:w="2160"/>
+        <w:gridCol w:w="2160"/>
+        <w:gridCol w:w="2160"/>
+      </w:tblGrid>
+      <w:tr>
+        <w:tc>
+          <w:tcPr>
+            <w:tcW w:type="dxa" w:w="2160"/>
+          </w:tcPr>
+          <w:p>
+            <w:r>
+              <w:rPr>
+                <w:b/>
+              </w:rPr>
+              <w:t>Feature / Capability</w:t>
+            </w:r>
+          </w:p>
+        </w:tc>
+        <w:tc>
+          <w:tcPr>
+            <w:tcW w:type="dxa" w:w="2160"/>
+          </w:tcPr>
+          <w:p>
+            <w:r>
+              <w:rPr>
+                <w:b/>
+              </w:rPr>
+              <w:t>Google Maps API</w:t>
+            </w:r>
+          </w:p>
+        </w:tc>
+        <w:tc>
+          <w:tcPr>
+            <w:tcW w:type="dxa" w:w="2160"/>
+          </w:tcPr>
+          <w:p>
+            <w:r>
+              <w:rPr>
+                <w:b/>
+              </w:rPr>
+              <w:t>Mapbox Navigation</w:t>
+            </w:r>
+          </w:p>
+        </w:tc>
+        <w:tc>
+          <w:tcPr>
+            <w:tcW w:type="dxa" w:w="2160"/>
+          </w:tcPr>
+          <w:p>
+            <w:r>
+              <w:rPr>
+                <w:b/>
+              </w:rPr>
+              <w:t>Route Wise (Cyber Knight)</w:t>
+            </w:r>
+          </w:p>
+        </w:tc>
+      </w:tr>
+      <w:tr>
+        <w:tc>
+          <w:tcPr>
+            <w:tcW w:type="dxa" w:w="2160"/>
+          </w:tcPr>
+          <w:p>
+            <w:r>
+              <w:t>Configurable Scoring Weights</w:t>
+            </w:r>
+          </w:p>
+        </w:tc>
+        <w:tc>
+          <w:tcPr>
+            <w:tcW w:type="dxa" w:w="2160"/>
+          </w:tcPr>
+          <w:p>
+            <w:r>
+              <w:t>No (Fixed default algorithm)</w:t>
+            </w:r>
+          </w:p>
+        </w:tc>
+        <w:tc>
+          <w:tcPr>
+            <w:tcW w:type="dxa" w:w="2160"/>
+          </w:tcPr>
+          <w:p>
+            <w:r>
+              <w:t>Partial (Limited vehicle profiles)</w:t>
+            </w:r>
+          </w:p>
+        </w:tc>
+        <w:tc>
+          <w:tcPr>
+            <w:tcW w:type="dxa" w:w="2160"/>
+          </w:tcPr>
+          <w:p>
+            <w:r>
+              <w:t>Yes — Customize Time, Delay Penalty &amp; Distance</w:t>
+            </w:r>
+          </w:p>
+        </w:tc>
+      </w:tr>
+      <w:tr>
+        <w:tc>
+          <w:tcPr>
+            <w:tcW w:type="dxa" w:w="2160"/>
+          </w:tcPr>
+          <w:p>
+            <w:r>
+              <w:t>Transparent 'Why' Rationale</w:t>
+            </w:r>
+          </w:p>
+        </w:tc>
+        <w:tc>
+          <w:tcPr>
+            <w:tcW w:type="dxa" w:w="2160"/>
+          </w:tcPr>
+          <w:p>
+            <w:r>
+              <w:t>No (Opaque black-box route)</w:t>
+            </w:r>
+          </w:p>
+        </w:tc>
+        <w:tc>
+          <w:tcPr>
+            <w:tcW w:type="dxa" w:w="2160"/>
+          </w:tcPr>
+          <w:p>
+            <w:r>
+              <w:t>No (No explanation given)</w:t>
+            </w:r>
+          </w:p>
+        </w:tc>
+        <w:tc>
+          <w:tcPr>
+            <w:tcW w:type="dxa" w:w="2160"/>
+          </w:tcPr>
+          <w:p>
+            <w:r>
+              <w:t>Yes — Clear tags like 'Saves 14m &amp; 37 km shorter'</w:t>
+            </w:r>
+          </w:p>
+        </w:tc>
+      </w:tr>
+      <w:tr>
+        <w:tc>
+          <w:tcPr>
+            <w:tcW w:type="dxa" w:w="2160"/>
+          </w:tcPr>
+          <w:p>
+            <w:r>
+              <w:t>15-Min ML Traffic Forecast</w:t>
+            </w:r>
+          </w:p>
+        </w:tc>
+        <w:tc>
+          <w:tcPr>
+            <w:tcW w:type="dxa" w:w="2160"/>
+          </w:tcPr>
+          <w:p>
+            <w:r>
+              <w:t>No (Live conditions only)</w:t>
+            </w:r>
+          </w:p>
+        </w:tc>
+        <w:tc>
+          <w:tcPr>
+            <w:tcW w:type="dxa" w:w="2160"/>
+          </w:tcPr>
+          <w:p>
+            <w:r>
+              <w:t>No (Historical averages only)</w:t>
+            </w:r>
+          </w:p>
+        </w:tc>
+        <w:tc>
+          <w:tcPr>
+            <w:tcW w:type="dxa" w:w="2160"/>
+          </w:tcPr>
+          <w:p>
+            <w:r>
+              <w:t>Yes — Public ARIMA(1,0,1) model for +15m, +30m, +45m</w:t>
+            </w:r>
+          </w:p>
+        </w:tc>
+      </w:tr>
+      <w:tr>
+        <w:tc>
+          <w:tcPr>
+            <w:tcW w:type="dxa" w:w="2160"/>
+          </w:tcPr>
+          <w:p>
+            <w:r>
+              <w:t>Traffic Severity Badges</w:t>
+            </w:r>
+          </w:p>
+        </w:tc>
+        <w:tc>
+          <w:tcPr>
+            <w:tcW w:type="dxa" w:w="2160"/>
+          </w:tcPr>
+          <w:p>
+            <w:r>
+              <w:t>Partial (Visual map lines only)</w:t>
+            </w:r>
+          </w:p>
+        </w:tc>
+        <w:tc>
+          <w:tcPr>
+            <w:tcW w:type="dxa" w:w="2160"/>
+          </w:tcPr>
+          <w:p>
+            <w:r>
+              <w:t>Partial (Generic speed colors)</w:t>
+            </w:r>
+          </w:p>
+        </w:tc>
+        <w:tc>
+          <w:tcPr>
+            <w:tcW w:type="dxa" w:w="2160"/>
+          </w:tcPr>
+          <w:p>
+            <w:r>
+              <w:t>Yes — Green / Yellow / Red delay classifier</w:t>
+            </w:r>
+          </w:p>
+        </w:tc>
+      </w:tr>
+      <w:tr>
+        <w:tc>
+          <w:tcPr>
+            <w:tcW w:type="dxa" w:w="2160"/>
+          </w:tcPr>
+          <w:p>
+            <w:r>
+              <w:t>Offline Demo Fail-Safe</w:t>
+            </w:r>
+          </w:p>
+        </w:tc>
+        <w:tc>
+          <w:tcPr>
+            <w:tcW w:type="dxa" w:w="2160"/>
+          </w:tcPr>
+          <w:p>
+            <w:r>
+              <w:t>No (Fails if internet drops)</w:t>
+            </w:r>
+          </w:p>
+        </w:tc>
+        <w:tc>
+          <w:tcPr>
+            <w:tcW w:type="dxa" w:w="2160"/>
+          </w:tcPr>
+          <w:p>
+            <w:r>
+              <w:t>No (Requires paid offline packs)</w:t>
+            </w:r>
+          </w:p>
+        </w:tc>
+        <w:tc>
+          <w:tcPr>
+            <w:tcW w:type="dxa" w:w="2160"/>
+          </w:tcPr>
+          <w:p>
+            <w:r>
+              <w:t>Yes — High-fidelity local coordinate dictionary</w:t>
+            </w:r>
+          </w:p>
+        </w:tc>
+      </w:tr>
+      <w:tr>
+        <w:tc>
+          <w:tcPr>
+            <w:tcW w:type="dxa" w:w="2160"/>
+          </w:tcPr>
+          <w:p>
+            <w:r>
+              <w:t>Side-by-Side Comparison Matrix</w:t>
+            </w:r>
+          </w:p>
+        </w:tc>
+        <w:tc>
+          <w:tcPr>
+            <w:tcW w:type="dxa" w:w="2160"/>
+          </w:tcPr>
+          <w:p>
+            <w:r>
+              <w:t>No (Must switch back &amp; forth)</w:t>
+            </w:r>
+          </w:p>
+        </w:tc>
+        <w:tc>
+          <w:tcPr>
+            <w:tcW w:type="dxa" w:w="2160"/>
+          </w:tcPr>
+          <w:p>
+            <w:r>
+              <w:t>No (Single route view)</w:t>
+            </w:r>
+          </w:p>
+        </w:tc>
+        <w:tc>
+          <w:tcPr>
+            <w:tcW w:type="dxa" w:w="2160"/>
+          </w:tcPr>
+          <w:p>
+            <w:r>
+              <w:t>Yes — Simultaneous comparison table</w:t>
+            </w:r>
+          </w:p>
+        </w:tc>
+      </w:tr>
+    </w:tbl>
+    <w:p>
+      <w:pPr>
+        <w:pStyle w:val="Heading3"/>
+      </w:pPr>
+      <w:r>
+        <w:t>4.3 Top 3 Takeaways to Explain to Judges</w:t>
       </w:r>
     </w:p>
     <w:p>
       <w:r>
-        <w:t>Persona 1: Karthik Sundaram (Age 27, IT Analyst)</w:t>
+        <w:t>1. Not Just Another Map: We don't reinvent map tiles; we solve the intelligence layer that evaluates multiple alternatives and tells you why Route #1 is the best.</w:t>
         <w:br/>
-        <w:t>Goal: Reach office by 9:00 AM without wasting 35m in signal idling.</w:t>
+        <w:t>2. Tangible Commuter ROI: Saving 15 minutes of junction delay per trip directly reduces fuel consumption, vehicle wear, late penalties, and driver burnout.</w:t>
         <w:br/>
-        <w:t>Pain Points: 5 red-light cycle queues; apps show red only after entering the chokepoint.</w:t>
-        <w:br/>
-        <w:t>Workaround: Leaves 40m early; calls colleagues ahead on phone to ask if the bridge is jammed.</w:t>
-      </w:r>
-    </w:p>
-    <w:p>
-      <w:r>
-        <w:t>Persona 2: Selvi Murugan (Age 36, Delivery Driver)</w:t>
-        <w:br/>
-        <w:t>Goal: Complete 8 scheduled deliveries within SLA windows (10 AM - 2 PM).</w:t>
-        <w:br/>
-        <w:t>Pain Points: Missed delivery penalties from sudden junction choke-points; high fuel waste.</w:t>
-        <w:br/>
-        <w:t>Workaround: Asks auto drivers at intersections; relies on memorized fixed streets.</w:t>
-      </w:r>
-    </w:p>
-    <w:p>
-      <w:pPr>
-        <w:pStyle w:val="Heading1"/>
-      </w:pPr>
-      <w:r>
-        <w:t>3. Validated One-Sentence Need Statement</w:t>
-      </w:r>
-    </w:p>
-    <w:p>
-      <w:r>
-        <w:rPr>
-          <w:b/>
-          <w:color w:val="1E1B4B"/>
-        </w:rPr>
-        <w:t>"Daily peak-hour urban commuters and delivery drivers need an intelligent, transparent traffic advisory tool that proactively evaluates and recommends alternative junction bypass routes because static road networks concentrate severe delay at predictable signal bottlenecks; today they rely on habit, peer phone calls, and generic map apps, which fails when bottleneck junctions freeze and drivers are given no comparative explanation of which nearby bypass corridor is truly faster, shorter, and less congested."</w:t>
-      </w:r>
-    </w:p>
-    <w:p>
-      <w:pPr>
-        <w:pStyle w:val="Heading1"/>
-      </w:pPr>
-      <w:r>
-        <w:t>4. Competitor Analysis &amp; Solution Gap</w:t>
-      </w:r>
-    </w:p>
-    <w:p>
-      <w:r>
-        <w:t>1. Google Maps: Blindly herds traffic to main roads; opaque ETA never explains why alternates were rejected.</w:t>
-        <w:br/>
-        <w:t>2. Waze: Relies on crowdsourced alerts; community data is sparse in Tier-2 Indian cities.</w:t>
-        <w:br/>
-        <w:t>3. Driver Habit &amp; Peer Calls: Dangerous while driving; reports lag by 15-30m.</w:t>
-        <w:br/>
-        <w:t>Route Wise Differentiator: Deterministic TomTom speed vectors and explainable comparative rationale.</w:t>
-      </w:r>
-    </w:p>
-    <w:p>
-      <w:pPr>
-        <w:pStyle w:val="Heading1"/>
-      </w:pPr>
-      <w:r>
-        <w:t>5. Key Assumptions Audit</w:t>
-      </w:r>
-    </w:p>
-    <w:p>
-      <w:r>
-        <w:t>[ASSUMPTION 1 - Delay Scale]: Commuters lose 25-45 minutes daily at congested intersections. (Weakest Assumption 1)</w:t>
-        <w:br/>
-        <w:t>[ASSUMPTION 2 - Detour Elasticity]: Over 75% of commuters will accept a 15-20% longer distance to save &gt;= 10 mins of delay. (Weakest Assumption 2)</w:t>
-        <w:br/>
-        <w:t>[ASSUMPTION 3 - Telemetry Refresh]: Live traffic API speed updates reflect signal queue clearance within 3 mins. (Weakest Assumption 3)</w:t>
-      </w:r>
-    </w:p>
-    <w:p>
-      <w:pPr>
-        <w:pStyle w:val="Heading1"/>
-      </w:pPr>
-      <w:r>
-        <w:t>6. Stage 2 Micro-Level Self-Evaluation Checklist (Form 2)</w:t>
-      </w:r>
-    </w:p>
-    <w:p>
-      <w:r>
-        <w:t>Result: 15.0 / 15.0 Marks (PASS · 100% Gate 2 Compliance across Personas, Real Need, Alternatives, and Assumptions).</w:t>
+        <w:t>3. Production-Ready Tech: Powered by TomTom live traffic, public ARIMA (1,0,1) ML forecasting, resilient fail-safes, and 40 automated tests passed at 100%.</w:t>
       </w:r>
     </w:p>
     <w:sectPr>
       <w:pgSz w:w="12240" w:h="15840"/>
-      <w:pgMar w:top="1080" w:right="1080" w:bottom="1080" w:left="1080" w:header="720" w:footer="720" w:gutter="0"/>
+      <w:pgMar w:top="1440" w:right="1800" w:bottom="1440" w:left="1800" w:header="720" w:footer="720" w:gutter="0"/>
       <w:cols w:space="720"/>
       <w:docGrid w:linePitch="360"/>
     </w:sectPr>

</xml_diff>

<commit_message>
docs: add MRD and PRD documents for Cyber Knight project
</commit_message>
<xml_diff>
--- a/MRD/Cyber Knight - Commuters Waste Time at Congested Junctions - MRD.docx
+++ b/MRD/Cyber Knight - Commuters Waste Time at Congested Junctions - MRD.docx
@@ -46,16 +46,27 @@
         <w:pStyle w:val="Heading2"/>
       </w:pPr>
       <w:r>
-        <w:t>1. Real-World Story: Why Traditional GPS Fails Drivers</w:t>
+        <w:t>1. Real-World Stories: Why Traditional GPS Fails Commuters &amp; Couriers</w:t>
       </w:r>
     </w:p>
     <w:p>
       <w:r>
-        <w:t>The Scenario (Meet Karthik the Daily Commuter &amp; Courier): It is 5:15 PM during evening rush hour in Tiruchirappalli. Karthik has an urgent trip / package delivery from Central Bus Stand to Cantonment &amp; Thillai Nagar.</w:t>
+        <w:t>Story 1: Karthik (Daily Office Commuter, 9:00 AM Cutoff):</w:t>
         <w:br/>
-        <w:t>• What Traditional GPS Does: It recommends Route A (Direct City Arterial) because it is only 10.0 km. However, City Arterial has an unexpected bottleneck with 18 minutes of bumper-to-bumper traffic delay. Total travel time: 42 minutes. Karthik arrives late, fuel is wasted, and stress peaks.</w:t>
+        <w:t>It is 5:15 PM peak evening rush hour in Tiruchirappalli. Karthik is traveling from Central Bus Stand to Cantonment.</w:t>
         <w:br/>
-        <w:t>• What Route Wise Does: Route Wise analyzes 3 alternatives simultaneously. It recognizes that Route B (Outer Ring Corridor) is 12.5 km (2.5 km longer), but has almost zero congestion (only 2 minutes of delay). Total travel time: 26 minutes. Route Wise recommends Route B, explaining: 'Fastest path — Avoids 16 minutes of traffic jam'. Karthik arrives 16 minutes early!</w:t>
+        <w:t>• Traditional GPS recommends Route A (Direct City Arterial, 10.0 km) with unexpected junction bottleneck (+18m delay, 42m total). Karthik is late.</w:t>
+        <w:br/>
+        <w:t>• Route Wise recommends Route B (Outer Ring Corridor, 12.5 km, +2m delay, 26m total), saving 16 minutes!</w:t>
+        <w:br/>
+        <w:br/>
+        <w:t>Story 2: Selvi (Quick-Commerce Delivery Rider, 15-Minute SLA):</w:t>
+        <w:br/>
+        <w:t>It is 8:30 PM and Selvi has 3 grocery orders with a strict 15-minute delivery promise.</w:t>
+        <w:br/>
+        <w:t>• Traditional GPS sends her down Main Bazaar Road (3.2 km), but junction signal queues add +9 minutes of delay (17m total), breaching SLA and incurring penalties.</w:t>
+        <w:br/>
+        <w:t>• Route Wise detects junction gridlock ahead, routing her via a 4.1 km parallel residential bypass corridor taking only 8 minutes (0m delay). She delivers with 7 minutes to spare and earns her peak bonus!</w:t>
       </w:r>
     </w:p>
     <w:tbl>
@@ -65,29 +76,43 @@
         <w:tblLook w:firstColumn="1" w:firstRow="1" w:lastColumn="0" w:lastRow="0" w:noHBand="0" w:noVBand="1" w:val="04A0"/>
       </w:tblPr>
       <w:tblGrid>
-        <w:gridCol w:w="1728"/>
-        <w:gridCol w:w="1728"/>
-        <w:gridCol w:w="1728"/>
-        <w:gridCol w:w="1728"/>
-        <w:gridCol w:w="1728"/>
+        <w:gridCol w:w="1440"/>
+        <w:gridCol w:w="1440"/>
+        <w:gridCol w:w="1440"/>
+        <w:gridCol w:w="1440"/>
+        <w:gridCol w:w="1440"/>
+        <w:gridCol w:w="1440"/>
       </w:tblGrid>
       <w:tr>
         <w:tc>
           <w:tcPr>
-            <w:tcW w:type="dxa" w:w="1728"/>
+            <w:tcW w:type="dxa" w:w="1440"/>
           </w:tcPr>
           <w:p>
             <w:r>
               <w:rPr>
                 <w:b/>
               </w:rPr>
-              <w:t>Navigation Strategy</w:t>
+              <w:t>Persona &amp; Journey</w:t>
             </w:r>
           </w:p>
         </w:tc>
         <w:tc>
           <w:tcPr>
-            <w:tcW w:type="dxa" w:w="1728"/>
+            <w:tcW w:type="dxa" w:w="1440"/>
+          </w:tcPr>
+          <w:p>
+            <w:r>
+              <w:rPr>
+                <w:b/>
+              </w:rPr>
+              <w:t>GPS Strategy</w:t>
+            </w:r>
+          </w:p>
+        </w:tc>
+        <w:tc>
+          <w:tcPr>
+            <w:tcW w:type="dxa" w:w="1440"/>
           </w:tcPr>
           <w:p>
             <w:r>
@@ -100,20 +125,20 @@
         </w:tc>
         <w:tc>
           <w:tcPr>
-            <w:tcW w:type="dxa" w:w="1728"/>
+            <w:tcW w:type="dxa" w:w="1440"/>
           </w:tcPr>
           <w:p>
             <w:r>
               <w:rPr>
                 <w:b/>
               </w:rPr>
-              <w:t>Traffic Delay</w:t>
+              <w:t>Delay</w:t>
             </w:r>
           </w:p>
         </w:tc>
         <w:tc>
           <w:tcPr>
-            <w:tcW w:type="dxa" w:w="1728"/>
+            <w:tcW w:type="dxa" w:w="1440"/>
           </w:tcPr>
           <w:p>
             <w:r>
@@ -126,14 +151,14 @@
         </w:tc>
         <w:tc>
           <w:tcPr>
-            <w:tcW w:type="dxa" w:w="1728"/>
+            <w:tcW w:type="dxa" w:w="1440"/>
           </w:tcPr>
           <w:p>
             <w:r>
               <w:rPr>
                 <w:b/>
               </w:rPr>
-              <w:t>Driver &amp; Commuter Outcome</w:t>
+              <w:t>Outcome &amp; Business Impact</w:t>
             </w:r>
           </w:p>
         </w:tc>
@@ -141,37 +166,47 @@
       <w:tr>
         <w:tc>
           <w:tcPr>
-            <w:tcW w:type="dxa" w:w="1728"/>
+            <w:tcW w:type="dxa" w:w="1440"/>
           </w:tcPr>
           <w:p>
             <w:r>
-              <w:t>Standard Navigation App (Picks shortest distance)</w:t>
+              <w:t>Karthik (Office Commute)</w:t>
             </w:r>
           </w:p>
         </w:tc>
         <w:tc>
           <w:tcPr>
-            <w:tcW w:type="dxa" w:w="1728"/>
+            <w:tcW w:type="dxa" w:w="1440"/>
           </w:tcPr>
           <w:p>
             <w:r>
-              <w:t>10.0 km (Shortest)</w:t>
+              <w:t>Standard GPS (Shortest)</w:t>
             </w:r>
           </w:p>
         </w:tc>
         <w:tc>
           <w:tcPr>
-            <w:tcW w:type="dxa" w:w="1728"/>
+            <w:tcW w:type="dxa" w:w="1440"/>
           </w:tcPr>
           <w:p>
             <w:r>
-              <w:t>+18 mins (Heavy gridlock)</w:t>
+              <w:t>10.0 km</w:t>
             </w:r>
           </w:p>
         </w:tc>
         <w:tc>
           <w:tcPr>
-            <w:tcW w:type="dxa" w:w="1728"/>
+            <w:tcW w:type="dxa" w:w="1440"/>
+          </w:tcPr>
+          <w:p>
+            <w:r>
+              <w:t>+18m</w:t>
+            </w:r>
+          </w:p>
+        </w:tc>
+        <w:tc>
+          <w:tcPr>
+            <w:tcW w:type="dxa" w:w="1440"/>
           </w:tcPr>
           <w:p>
             <w:r>
@@ -181,11 +216,11 @@
         </w:tc>
         <w:tc>
           <w:tcPr>
-            <w:tcW w:type="dxa" w:w="1728"/>
+            <w:tcW w:type="dxa" w:w="1440"/>
           </w:tcPr>
           <w:p>
             <w:r>
-              <w:t>Late delivery, high stress, fuel wasted idling in traffic jam.</w:t>
+              <w:t>Late arrival, high stress, fuel wasted idling in junction.</w:t>
             </w:r>
           </w:p>
         </w:tc>
@@ -193,51 +228,185 @@
       <w:tr>
         <w:tc>
           <w:tcPr>
-            <w:tcW w:type="dxa" w:w="1728"/>
+            <w:tcW w:type="dxa" w:w="1440"/>
           </w:tcPr>
           <w:p>
             <w:r>
-              <w:t>Route Wise (Cyber Knight) (Multi-criteria AI + ARIMA)</w:t>
+              <w:t>Karthik (Office Commute)</w:t>
             </w:r>
           </w:p>
         </w:tc>
         <w:tc>
           <w:tcPr>
-            <w:tcW w:type="dxa" w:w="1728"/>
+            <w:tcW w:type="dxa" w:w="1440"/>
           </w:tcPr>
           <w:p>
             <w:r>
-              <w:t>12.5 km (+2.5 km)</w:t>
+              <w:t>Route Wise AI (ARIMA + Scoring)</w:t>
             </w:r>
           </w:p>
         </w:tc>
         <w:tc>
           <w:tcPr>
-            <w:tcW w:type="dxa" w:w="1728"/>
+            <w:tcW w:type="dxa" w:w="1440"/>
           </w:tcPr>
           <w:p>
             <w:r>
-              <w:t>+2 mins (Smooth flowing)</w:t>
+              <w:t>12.5 km</w:t>
             </w:r>
           </w:p>
         </w:tc>
         <w:tc>
           <w:tcPr>
-            <w:tcW w:type="dxa" w:w="1728"/>
+            <w:tcW w:type="dxa" w:w="1440"/>
           </w:tcPr>
           <w:p>
             <w:r>
-              <w:t>26 mins (16m faster!)</w:t>
+              <w:t>+2m</w:t>
             </w:r>
           </w:p>
         </w:tc>
         <w:tc>
           <w:tcPr>
-            <w:tcW w:type="dxa" w:w="1728"/>
+            <w:tcW w:type="dxa" w:w="1440"/>
           </w:tcPr>
           <w:p>
             <w:r>
-              <w:t>On-time delivery, clear trade-off explanation, fuel-efficient constant speed.</w:t>
+              <w:t>26 mins</w:t>
+            </w:r>
+          </w:p>
+        </w:tc>
+        <w:tc>
+          <w:tcPr>
+            <w:tcW w:type="dxa" w:w="1440"/>
+          </w:tcPr>
+          <w:p>
+            <w:r>
+              <w:t>16m faster, on-time punch-in, constant fuel-efficient speed.</w:t>
+            </w:r>
+          </w:p>
+        </w:tc>
+      </w:tr>
+      <w:tr>
+        <w:tc>
+          <w:tcPr>
+            <w:tcW w:type="dxa" w:w="1440"/>
+          </w:tcPr>
+          <w:p>
+            <w:r>
+              <w:t>Selvi (Quick-Commerce)</w:t>
+            </w:r>
+          </w:p>
+        </w:tc>
+        <w:tc>
+          <w:tcPr>
+            <w:tcW w:type="dxa" w:w="1440"/>
+          </w:tcPr>
+          <w:p>
+            <w:r>
+              <w:t>Standard GPS (Shortest)</w:t>
+            </w:r>
+          </w:p>
+        </w:tc>
+        <w:tc>
+          <w:tcPr>
+            <w:tcW w:type="dxa" w:w="1440"/>
+          </w:tcPr>
+          <w:p>
+            <w:r>
+              <w:t>3.2 km</w:t>
+            </w:r>
+          </w:p>
+        </w:tc>
+        <w:tc>
+          <w:tcPr>
+            <w:tcW w:type="dxa" w:w="1440"/>
+          </w:tcPr>
+          <w:p>
+            <w:r>
+              <w:t>+9m</w:t>
+            </w:r>
+          </w:p>
+        </w:tc>
+        <w:tc>
+          <w:tcPr>
+            <w:tcW w:type="dxa" w:w="1440"/>
+          </w:tcPr>
+          <w:p>
+            <w:r>
+              <w:t>17 mins</w:t>
+            </w:r>
+          </w:p>
+        </w:tc>
+        <w:tc>
+          <w:tcPr>
+            <w:tcW w:type="dxa" w:w="1440"/>
+          </w:tcPr>
+          <w:p>
+            <w:r>
+              <w:t>SLA Breached, customer rating penalty, lost incentive.</w:t>
+            </w:r>
+          </w:p>
+        </w:tc>
+      </w:tr>
+      <w:tr>
+        <w:tc>
+          <w:tcPr>
+            <w:tcW w:type="dxa" w:w="1440"/>
+          </w:tcPr>
+          <w:p>
+            <w:r>
+              <w:t>Selvi (Quick-Commerce)</w:t>
+            </w:r>
+          </w:p>
+        </w:tc>
+        <w:tc>
+          <w:tcPr>
+            <w:tcW w:type="dxa" w:w="1440"/>
+          </w:tcPr>
+          <w:p>
+            <w:r>
+              <w:t>Route Wise AI (Bypass Corridor)</w:t>
+            </w:r>
+          </w:p>
+        </w:tc>
+        <w:tc>
+          <w:tcPr>
+            <w:tcW w:type="dxa" w:w="1440"/>
+          </w:tcPr>
+          <w:p>
+            <w:r>
+              <w:t>4.1 km</w:t>
+            </w:r>
+          </w:p>
+        </w:tc>
+        <w:tc>
+          <w:tcPr>
+            <w:tcW w:type="dxa" w:w="1440"/>
+          </w:tcPr>
+          <w:p>
+            <w:r>
+              <w:t>+0m</w:t>
+            </w:r>
+          </w:p>
+        </w:tc>
+        <w:tc>
+          <w:tcPr>
+            <w:tcW w:type="dxa" w:w="1440"/>
+          </w:tcPr>
+          <w:p>
+            <w:r>
+              <w:t>8 mins</w:t>
+            </w:r>
+          </w:p>
+        </w:tc>
+        <w:tc>
+          <w:tcPr>
+            <w:tcW w:type="dxa" w:w="1440"/>
+          </w:tcPr>
+          <w:p>
+            <w:r>
+              <w:t>SLA Achieved (7m early), zero junction stops, peak bonus earned.</w:t>
             </w:r>
           </w:p>
         </w:tc>

</xml_diff>

<commit_message>
docs: synchronize MRD and PRD PDFs and DOCX with latest story formatting
</commit_message>
<xml_diff>
--- a/MRD/Cyber Knight - Commuters Waste Time at Congested Junctions - MRD.docx
+++ b/MRD/Cyber Knight - Commuters Waste Time at Congested Junctions - MRD.docx
@@ -46,27 +46,16 @@
         <w:pStyle w:val="Heading2"/>
       </w:pPr>
       <w:r>
-        <w:t>1. Real-World Stories: Why Traditional GPS Fails Commuters &amp; Couriers</w:t>
+        <w:t>1. Real-World Story: Why Traditional GPS Fails Drivers</w:t>
       </w:r>
     </w:p>
     <w:p>
       <w:r>
-        <w:t>Story 1: Karthik (Daily Office Commuter, 9:00 AM Cutoff):</w:t>
+        <w:t>The Scenario (Meet Karthik the Daily Commuter &amp; Courier): It is 5:15 PM during evening rush hour in Tiruchirappalli. Karthik has an urgent trip / package delivery from Central Bus Stand to Cantonment &amp; Thillai Nagar.</w:t>
         <w:br/>
-        <w:t>It is 5:15 PM peak evening rush hour in Tiruchirappalli. Karthik is traveling from Central Bus Stand to Cantonment.</w:t>
+        <w:t>• What Traditional GPS Does: It recommends Route A (Direct City Arterial) because it is only 10.0 km. However, City Arterial has an unexpected bottleneck with 18 minutes of bumper-to-bumper traffic delay. Total travel time: 42 minutes. Karthik arrives late, fuel is wasted, and stress peaks.</w:t>
         <w:br/>
-        <w:t>• Traditional GPS recommends Route A (Direct City Arterial, 10.0 km) with unexpected junction bottleneck (+18m delay, 42m total). Karthik is late.</w:t>
-        <w:br/>
-        <w:t>• Route Wise recommends Route B (Outer Ring Corridor, 12.5 km, +2m delay, 26m total), saving 16 minutes!</w:t>
-        <w:br/>
-        <w:br/>
-        <w:t>Story 2: Selvi (Quick-Commerce Delivery Rider, 15-Minute SLA):</w:t>
-        <w:br/>
-        <w:t>It is 8:30 PM and Selvi has 3 grocery orders with a strict 15-minute delivery promise.</w:t>
-        <w:br/>
-        <w:t>• Traditional GPS sends her down Main Bazaar Road (3.2 km), but junction signal queues add +9 minutes of delay (17m total), breaching SLA and incurring penalties.</w:t>
-        <w:br/>
-        <w:t>• Route Wise detects junction gridlock ahead, routing her via a 4.1 km parallel residential bypass corridor taking only 8 minutes (0m delay). She delivers with 7 minutes to spare and earns her peak bonus!</w:t>
+        <w:t>• What Route Wise Does: Route Wise analyzes 3 alternatives simultaneously. It recognizes that Route B (Outer Ring Corridor) is 12.5 km (2.5 km longer), but has almost zero congestion (only 2 minutes of delay). Total travel time: 26 minutes. Route Wise recommends Route B, explaining: 'Fastest path — Avoids 16 minutes of traffic jam'. Karthik arrives 16 minutes early!</w:t>
       </w:r>
     </w:p>
     <w:tbl>
@@ -76,43 +65,29 @@
         <w:tblLook w:firstColumn="1" w:firstRow="1" w:lastColumn="0" w:lastRow="0" w:noHBand="0" w:noVBand="1" w:val="04A0"/>
       </w:tblPr>
       <w:tblGrid>
-        <w:gridCol w:w="1440"/>
-        <w:gridCol w:w="1440"/>
-        <w:gridCol w:w="1440"/>
-        <w:gridCol w:w="1440"/>
-        <w:gridCol w:w="1440"/>
-        <w:gridCol w:w="1440"/>
+        <w:gridCol w:w="1728"/>
+        <w:gridCol w:w="1728"/>
+        <w:gridCol w:w="1728"/>
+        <w:gridCol w:w="1728"/>
+        <w:gridCol w:w="1728"/>
       </w:tblGrid>
       <w:tr>
         <w:tc>
           <w:tcPr>
-            <w:tcW w:type="dxa" w:w="1440"/>
+            <w:tcW w:type="dxa" w:w="1728"/>
           </w:tcPr>
           <w:p>
             <w:r>
               <w:rPr>
                 <w:b/>
               </w:rPr>
-              <w:t>Persona &amp; Journey</w:t>
+              <w:t>Navigation Strategy</w:t>
             </w:r>
           </w:p>
         </w:tc>
         <w:tc>
           <w:tcPr>
-            <w:tcW w:type="dxa" w:w="1440"/>
-          </w:tcPr>
-          <w:p>
-            <w:r>
-              <w:rPr>
-                <w:b/>
-              </w:rPr>
-              <w:t>GPS Strategy</w:t>
-            </w:r>
-          </w:p>
-        </w:tc>
-        <w:tc>
-          <w:tcPr>
-            <w:tcW w:type="dxa" w:w="1440"/>
+            <w:tcW w:type="dxa" w:w="1728"/>
           </w:tcPr>
           <w:p>
             <w:r>
@@ -125,20 +100,20 @@
         </w:tc>
         <w:tc>
           <w:tcPr>
-            <w:tcW w:type="dxa" w:w="1440"/>
+            <w:tcW w:type="dxa" w:w="1728"/>
           </w:tcPr>
           <w:p>
             <w:r>
               <w:rPr>
                 <w:b/>
               </w:rPr>
-              <w:t>Delay</w:t>
+              <w:t>Traffic Delay</w:t>
             </w:r>
           </w:p>
         </w:tc>
         <w:tc>
           <w:tcPr>
-            <w:tcW w:type="dxa" w:w="1440"/>
+            <w:tcW w:type="dxa" w:w="1728"/>
           </w:tcPr>
           <w:p>
             <w:r>
@@ -151,14 +126,14 @@
         </w:tc>
         <w:tc>
           <w:tcPr>
-            <w:tcW w:type="dxa" w:w="1440"/>
+            <w:tcW w:type="dxa" w:w="1728"/>
           </w:tcPr>
           <w:p>
             <w:r>
               <w:rPr>
                 <w:b/>
               </w:rPr>
-              <w:t>Outcome &amp; Business Impact</w:t>
+              <w:t>Driver &amp; Commuter Outcome</w:t>
             </w:r>
           </w:p>
         </w:tc>
@@ -166,47 +141,37 @@
       <w:tr>
         <w:tc>
           <w:tcPr>
-            <w:tcW w:type="dxa" w:w="1440"/>
+            <w:tcW w:type="dxa" w:w="1728"/>
           </w:tcPr>
           <w:p>
             <w:r>
-              <w:t>Karthik (Office Commute)</w:t>
+              <w:t>Standard Navigation App (Picks shortest distance)</w:t>
             </w:r>
           </w:p>
         </w:tc>
         <w:tc>
           <w:tcPr>
-            <w:tcW w:type="dxa" w:w="1440"/>
+            <w:tcW w:type="dxa" w:w="1728"/>
           </w:tcPr>
           <w:p>
             <w:r>
-              <w:t>Standard GPS (Shortest)</w:t>
+              <w:t>10.0 km (Shortest)</w:t>
             </w:r>
           </w:p>
         </w:tc>
         <w:tc>
           <w:tcPr>
-            <w:tcW w:type="dxa" w:w="1440"/>
+            <w:tcW w:type="dxa" w:w="1728"/>
           </w:tcPr>
           <w:p>
             <w:r>
-              <w:t>10.0 km</w:t>
+              <w:t>+18 mins (Heavy gridlock)</w:t>
             </w:r>
           </w:p>
         </w:tc>
         <w:tc>
           <w:tcPr>
-            <w:tcW w:type="dxa" w:w="1440"/>
-          </w:tcPr>
-          <w:p>
-            <w:r>
-              <w:t>+18m</w:t>
-            </w:r>
-          </w:p>
-        </w:tc>
-        <w:tc>
-          <w:tcPr>
-            <w:tcW w:type="dxa" w:w="1440"/>
+            <w:tcW w:type="dxa" w:w="1728"/>
           </w:tcPr>
           <w:p>
             <w:r>
@@ -216,11 +181,11 @@
         </w:tc>
         <w:tc>
           <w:tcPr>
-            <w:tcW w:type="dxa" w:w="1440"/>
+            <w:tcW w:type="dxa" w:w="1728"/>
           </w:tcPr>
           <w:p>
             <w:r>
-              <w:t>Late arrival, high stress, fuel wasted idling in junction.</w:t>
+              <w:t>Late delivery, high stress, fuel wasted idling in traffic jam.</w:t>
             </w:r>
           </w:p>
         </w:tc>
@@ -228,185 +193,51 @@
       <w:tr>
         <w:tc>
           <w:tcPr>
-            <w:tcW w:type="dxa" w:w="1440"/>
+            <w:tcW w:type="dxa" w:w="1728"/>
           </w:tcPr>
           <w:p>
             <w:r>
-              <w:t>Karthik (Office Commute)</w:t>
+              <w:t>Route Wise (Cyber Knight) (Multi-criteria AI + ARIMA)</w:t>
             </w:r>
           </w:p>
         </w:tc>
         <w:tc>
           <w:tcPr>
-            <w:tcW w:type="dxa" w:w="1440"/>
+            <w:tcW w:type="dxa" w:w="1728"/>
           </w:tcPr>
           <w:p>
             <w:r>
-              <w:t>Route Wise AI (ARIMA + Scoring)</w:t>
+              <w:t>12.5 km (+2.5 km)</w:t>
             </w:r>
           </w:p>
         </w:tc>
         <w:tc>
           <w:tcPr>
-            <w:tcW w:type="dxa" w:w="1440"/>
+            <w:tcW w:type="dxa" w:w="1728"/>
           </w:tcPr>
           <w:p>
             <w:r>
-              <w:t>12.5 km</w:t>
+              <w:t>+2 mins (Smooth flowing)</w:t>
             </w:r>
           </w:p>
         </w:tc>
         <w:tc>
           <w:tcPr>
-            <w:tcW w:type="dxa" w:w="1440"/>
+            <w:tcW w:type="dxa" w:w="1728"/>
           </w:tcPr>
           <w:p>
             <w:r>
-              <w:t>+2m</w:t>
+              <w:t>26 mins (16m faster!)</w:t>
             </w:r>
           </w:p>
         </w:tc>
         <w:tc>
           <w:tcPr>
-            <w:tcW w:type="dxa" w:w="1440"/>
+            <w:tcW w:type="dxa" w:w="1728"/>
           </w:tcPr>
           <w:p>
             <w:r>
-              <w:t>26 mins</w:t>
-            </w:r>
-          </w:p>
-        </w:tc>
-        <w:tc>
-          <w:tcPr>
-            <w:tcW w:type="dxa" w:w="1440"/>
-          </w:tcPr>
-          <w:p>
-            <w:r>
-              <w:t>16m faster, on-time punch-in, constant fuel-efficient speed.</w:t>
-            </w:r>
-          </w:p>
-        </w:tc>
-      </w:tr>
-      <w:tr>
-        <w:tc>
-          <w:tcPr>
-            <w:tcW w:type="dxa" w:w="1440"/>
-          </w:tcPr>
-          <w:p>
-            <w:r>
-              <w:t>Selvi (Quick-Commerce)</w:t>
-            </w:r>
-          </w:p>
-        </w:tc>
-        <w:tc>
-          <w:tcPr>
-            <w:tcW w:type="dxa" w:w="1440"/>
-          </w:tcPr>
-          <w:p>
-            <w:r>
-              <w:t>Standard GPS (Shortest)</w:t>
-            </w:r>
-          </w:p>
-        </w:tc>
-        <w:tc>
-          <w:tcPr>
-            <w:tcW w:type="dxa" w:w="1440"/>
-          </w:tcPr>
-          <w:p>
-            <w:r>
-              <w:t>3.2 km</w:t>
-            </w:r>
-          </w:p>
-        </w:tc>
-        <w:tc>
-          <w:tcPr>
-            <w:tcW w:type="dxa" w:w="1440"/>
-          </w:tcPr>
-          <w:p>
-            <w:r>
-              <w:t>+9m</w:t>
-            </w:r>
-          </w:p>
-        </w:tc>
-        <w:tc>
-          <w:tcPr>
-            <w:tcW w:type="dxa" w:w="1440"/>
-          </w:tcPr>
-          <w:p>
-            <w:r>
-              <w:t>17 mins</w:t>
-            </w:r>
-          </w:p>
-        </w:tc>
-        <w:tc>
-          <w:tcPr>
-            <w:tcW w:type="dxa" w:w="1440"/>
-          </w:tcPr>
-          <w:p>
-            <w:r>
-              <w:t>SLA Breached, customer rating penalty, lost incentive.</w:t>
-            </w:r>
-          </w:p>
-        </w:tc>
-      </w:tr>
-      <w:tr>
-        <w:tc>
-          <w:tcPr>
-            <w:tcW w:type="dxa" w:w="1440"/>
-          </w:tcPr>
-          <w:p>
-            <w:r>
-              <w:t>Selvi (Quick-Commerce)</w:t>
-            </w:r>
-          </w:p>
-        </w:tc>
-        <w:tc>
-          <w:tcPr>
-            <w:tcW w:type="dxa" w:w="1440"/>
-          </w:tcPr>
-          <w:p>
-            <w:r>
-              <w:t>Route Wise AI (Bypass Corridor)</w:t>
-            </w:r>
-          </w:p>
-        </w:tc>
-        <w:tc>
-          <w:tcPr>
-            <w:tcW w:type="dxa" w:w="1440"/>
-          </w:tcPr>
-          <w:p>
-            <w:r>
-              <w:t>4.1 km</w:t>
-            </w:r>
-          </w:p>
-        </w:tc>
-        <w:tc>
-          <w:tcPr>
-            <w:tcW w:type="dxa" w:w="1440"/>
-          </w:tcPr>
-          <w:p>
-            <w:r>
-              <w:t>+0m</w:t>
-            </w:r>
-          </w:p>
-        </w:tc>
-        <w:tc>
-          <w:tcPr>
-            <w:tcW w:type="dxa" w:w="1440"/>
-          </w:tcPr>
-          <w:p>
-            <w:r>
-              <w:t>8 mins</w:t>
-            </w:r>
-          </w:p>
-        </w:tc>
-        <w:tc>
-          <w:tcPr>
-            <w:tcW w:type="dxa" w:w="1440"/>
-          </w:tcPr>
-          <w:p>
-            <w:r>
-              <w:t>SLA Achieved (7m early), zero junction stops, peak bonus earned.</w:t>
+              <w:t>On-time delivery, clear trade-off explanation, fuel-efficient constant speed.</w:t>
             </w:r>
           </w:p>
         </w:tc>

</xml_diff>

<commit_message>
feat: complete Gold Standard MRD/PRD, PWA support, community incidents, and authority triage
- Structured MRD and PRD to industry Gold Standard (<= 5 pages master PDF)
- Implemented F4 community crowd-sourced incident reporting with 2-vote consensus engine
- Implemented F5 municipal authority dashboard with 7-day recurrent hotspot triage
- Implemented Google Maps navigation handoff with decision-anchor corridor preservation
- Added progressive web app (PWA) manifest, service worker offline shell, and icons
- Integrated Trichy corridor presets and 120 FPS decoupled search typing
- Verified 100% pass across 99 automated tests (75 server + 24 client)
</commit_message>
<xml_diff>
--- a/MRD/Cyber Knight - Commuters Waste Time at Congested Junctions - MRD.docx
+++ b/MRD/Cyber Knight - Commuters Waste Time at Congested Junctions - MRD.docx
@@ -7,7 +7,7 @@
         <w:rPr>
           <w:b/>
           <w:color w:val="0F172A"/>
-          <w:sz w:val="36"/>
+          <w:sz w:val="32"/>
         </w:rPr>
         <w:t>Route Wise — Market Requirements Document (MRD)</w:t>
       </w:r>
@@ -16,29 +16,17 @@
       <w:r>
         <w:rPr>
           <w:color w:val="64748B"/>
-          <w:sz w:val="19"/>
+          <w:sz w:val="18"/>
         </w:rPr>
-        <w:t>DOCUMENT: MRD-v2.0 | TEAM: Cyber Knight | AUDIENCE: Mentors &amp; Judges | STATUS: Final Pitch Ready</w:t>
+        <w:t>DOCUMENT: MRD-v2.6-GOLD | TEAM: Cyber Knight | AUDIENCE: Mentors &amp; Judges | STATUS: Approved (99 Tests)</w:t>
       </w:r>
     </w:p>
     <w:p>
       <w:r>
         <w:rPr>
-          <w:b/>
-          <w:color w:val="1E40AF"/>
+          <w:sz w:val="19"/>
         </w:rPr>
-        <w:t>The Business Case, Market Need &amp; Real-World Problem — Explaining Route Wise in Simple English</w:t>
-      </w:r>
-    </w:p>
-    <w:p>
-      <w:pPr>
-        <w:ind w:left="288" w:right="288"/>
-      </w:pPr>
-      <w:r>
-        <w:rPr>
-          <w:sz w:val="20"/>
-        </w:rPr>
-        <w:t>The 30-Second Elevator Pitch for Judges: Most navigation apps blindly suggest the shortest route, even if it leads straight into heavy traffic gridlock. Route Wise (Team Cyber Knight) is an intelligent traffic advisory tool and live dashboard that compares multiple routes, penalizes severe traffic delays, and predicts 15-minute congestion trends using an official public ARIMA (1,0,1) model from GitHub. It explains why it chose the route in plain words (e.g. 'Saves 14 mins travel time and 37 km shorter vs Route #2'), saving time, fuel, and driver frustration for daily commuters and couriers.</w:t>
+        <w:t>The 30-Second Elevator Pitch: Most navigation apps blindly suggest the shortest route, funneling traffic into severe junction gridlock. Route Wise (Team Cyber Knight) is an intelligent traffic advisory platform, live glassmorphic dashboard, and installable PWA that evaluates multiple driving alternatives, penalizes junction bottlenecks using Adjusted ETA with an anti-flapping switch threshold, predicts 15-minute trends via ARIMA ML, and guarantees corridor retention during 1-tap Google Maps handoff.</w:t>
       </w:r>
     </w:p>
     <w:p>
@@ -46,16 +34,12 @@
         <w:pStyle w:val="Heading2"/>
       </w:pPr>
       <w:r>
-        <w:t>1. Real-World Story: Why Traditional GPS Fails Drivers</w:t>
+        <w:t>1. Problem Framing &amp; 5-Why Root Cause Analysis</w:t>
       </w:r>
     </w:p>
     <w:p>
       <w:r>
-        <w:t>The Scenario (Meet Karthik the Daily Commuter &amp; Courier): It is 5:15 PM during evening rush hour in Tiruchirappalli. Karthik has an urgent trip / package delivery from Central Bus Stand to Cantonment &amp; Thillai Nagar.</w:t>
-        <w:br/>
-        <w:t>• What Traditional GPS Does: It recommends Route A (Direct City Arterial) because it is only 10.0 km. However, City Arterial has an unexpected bottleneck with 18 minutes of bumper-to-bumper traffic delay. Total travel time: 42 minutes. Karthik arrives late, fuel is wasted, and stress peaks.</w:t>
-        <w:br/>
-        <w:t>• What Route Wise Does: Route Wise analyzes 3 alternatives simultaneously. It recognizes that Route B (Outer Ring Corridor) is 12.5 km (2.5 km longer), but has almost zero congestion (only 2 minutes of delay). Total travel time: 26 minutes. Route Wise recommends Route B, explaining: 'Fastest path — Avoids 16 minutes of traffic jam'. Karthik arrives 16 minutes early!</w:t>
+        <w:t>Validated Problem Statement: Daily commuters and couriers face 15-to-30-minute delays at junction bottlenecks in Tier-1/2 Indian cities (e.g. Tiruchirappalli), causing missed SLAs, excess fuel burn, and stress. Standard GPS algorithms over-weight physical distance and lack transparent trade-off explanations. Therefore, there is an urgent need for an explainable routing system that penalizes junction gridlock and validates crowd alerts.</w:t>
       </w:r>
     </w:p>
     <w:tbl>
@@ -145,7 +129,7 @@
           </w:tcPr>
           <w:p>
             <w:r>
-              <w:t>Standard Navigation App (Picks shortest distance)</w:t>
+              <w:t>Standard Navigation App (Shortest distance default)</w:t>
             </w:r>
           </w:p>
         </w:tc>
@@ -185,7 +169,7 @@
           </w:tcPr>
           <w:p>
             <w:r>
-              <w:t>Late delivery, high stress, fuel wasted idling in traffic jam.</w:t>
+              <w:t>Late arrival, customer SLA breach, high fuel wasted idling in junction bottleneck.</w:t>
             </w:r>
           </w:p>
         </w:tc>
@@ -197,7 +181,7 @@
           </w:tcPr>
           <w:p>
             <w:r>
-              <w:t>Route Wise (Cyber Knight) (Multi-criteria AI + ARIMA)</w:t>
+              <w:t>Route Wise (Cyber Knight) (Adjusted ETA + ARIMA ML)</w:t>
             </w:r>
           </w:p>
         </w:tc>
@@ -237,7 +221,7 @@
           </w:tcPr>
           <w:p>
             <w:r>
-              <w:t>On-time delivery, clear trade-off explanation, fuel-efficient constant speed.</w:t>
+              <w:t>On-time arrival, clear trade-off explanation, fuel-efficient constant speed corridor.</w:t>
             </w:r>
           </w:p>
         </w:tc>
@@ -248,16 +232,16 @@
         <w:pStyle w:val="Heading2"/>
       </w:pPr>
       <w:r>
-        <w:t>2. The Big Market Problem We Solve</w:t>
+        <w:t>2. Market Size: Multi-Billion Dollar Opportunity</w:t>
       </w:r>
     </w:p>
     <w:p>
       <w:r>
-        <w:t>1. Opaque 'Black-Box' Algorithms: Current mapping APIs provide a single route without explaining why it was picked, leaving dispatchers and commuters blind.</w:t>
+        <w:t>• TAM: $14.2 Billion — Global GIS, Navigation &amp; Fleet Logistics API Market (CAGR 12.4%)</w:t>
         <w:br/>
-        <w:t>2. Inability to Predict Traffic Spikes: Existing maps show current delay, but cannot tell if congestion will clear or worsen in 15 minutes.</w:t>
+        <w:t>• SAM: $2.8 Billion — Urban Last-Mile Delivery &amp; Commuter Routing Software Platforms</w:t>
         <w:br/>
-        <w:t>3. Demo &amp; Network Fragility: Traditional routing APIs break when offline or over quota. Developers need high-reliability fail-safes.</w:t>
+        <w:t>• SOM: $350 Million — Tier-1 &amp; Tier-2 Indian Logistics Startups, Fleets &amp; Commuters (Assumptions marked)</w:t>
       </w:r>
     </w:p>
     <w:p>
@@ -265,43 +249,7 @@
         <w:pStyle w:val="Heading2"/>
       </w:pPr>
       <w:r>
-        <w:t>3. Market Size: Multi-Billion Dollar Opportunity</w:t>
-      </w:r>
-    </w:p>
-    <w:p>
-      <w:r>
-        <w:t>• TAM: $14.2 Billion — Global GIS, Navigation &amp; Fleet Logistics API Market</w:t>
-        <w:br/>
-        <w:t>• SAM: $2.8 Billion — Urban Last-Mile Delivery &amp; Commuter Routing Software</w:t>
-        <w:br/>
-        <w:t>• SOM: $350 Million — Tier-2 &amp; Tier-1 Indian Logistics SaaS, Startups &amp; Commuters</w:t>
-      </w:r>
-    </w:p>
-    <w:p>
-      <w:pPr>
-        <w:pStyle w:val="Heading2"/>
-      </w:pPr>
-      <w:r>
-        <w:t>4. Target Audience, Competition &amp; Revenue Model</w:t>
-      </w:r>
-    </w:p>
-    <w:p>
-      <w:r>
-        <w:t>4.1 Target Customer Segments:</w:t>
-        <w:br/>
-        <w:t>• Daily Urban Commuters (2W &amp; 4W): Need to bypass known junction bottlenecks during 8:00 AM – 10:00 AM and 5:00 PM – 7:30 PM peak commutes.</w:t>
-        <w:br/>
-        <w:t>• On-Demand Couriers &amp; Delivery Platforms: Under strict SLAs (8 deliveries/hr). A 15-minute junction delay causes missed order deadlines and penalties.</w:t>
-        <w:br/>
-        <w:t>• Fleet &amp; Logistics Dispatchers: Managing delivery vans. A 15-minute delay per driver compounds into thousands of wasted fuel rupees weekly.</w:t>
-      </w:r>
-    </w:p>
-    <w:p>
-      <w:pPr>
-        <w:pStyle w:val="Heading3"/>
-      </w:pPr>
-      <w:r>
-        <w:t>4.2 Why Route Wise Wins Against Big Tech APIs</w:t>
+        <w:t>3. Competitive Moat Matrix</w:t>
       </w:r>
     </w:p>
     <w:tbl>
@@ -407,7 +355,7 @@
           </w:tcPr>
           <w:p>
             <w:r>
-              <w:t>Yes — Customize Time, Delay Penalty &amp; Distance</w:t>
+              <w:t>Yes — Adjusted ETA formula</w:t>
             </w:r>
           </w:p>
         </w:tc>
@@ -449,7 +397,7 @@
           </w:tcPr>
           <w:p>
             <w:r>
-              <w:t>Yes — Clear tags like 'Saves 14m &amp; 37 km shorter'</w:t>
+              <w:t>Yes — Comparative plain-English tags</w:t>
             </w:r>
           </w:p>
         </w:tc>
@@ -491,7 +439,7 @@
           </w:tcPr>
           <w:p>
             <w:r>
-              <w:t>Yes — Public ARIMA(1,0,1) model for +15m, +30m, +45m</w:t>
+              <w:t>Yes — Public ARIMA (1,0,1) model</w:t>
             </w:r>
           </w:p>
         </w:tc>
@@ -503,7 +451,7 @@
           </w:tcPr>
           <w:p>
             <w:r>
-              <w:t>Traffic Severity Badges</w:t>
+              <w:t>Anti-Flapping Switch Threshold</w:t>
             </w:r>
           </w:p>
         </w:tc>
@@ -513,7 +461,7 @@
           </w:tcPr>
           <w:p>
             <w:r>
-              <w:t>Partial (Visual map lines only)</w:t>
+              <w:t>No (Erratic flipping)</w:t>
             </w:r>
           </w:p>
         </w:tc>
@@ -523,7 +471,7 @@
           </w:tcPr>
           <w:p>
             <w:r>
-              <w:t>Partial (Generic speed colors)</w:t>
+              <w:t>No (Flips on minor delta)</w:t>
             </w:r>
           </w:p>
         </w:tc>
@@ -533,7 +481,91 @@
           </w:tcPr>
           <w:p>
             <w:r>
-              <w:t>Yes — Green / Yellow / Red delay classifier</w:t>
+              <w:t>Yes — max(180s, 10% ETA)</w:t>
+            </w:r>
+          </w:p>
+        </w:tc>
+      </w:tr>
+      <w:tr>
+        <w:tc>
+          <w:tcPr>
+            <w:tcW w:type="dxa" w:w="2160"/>
+          </w:tcPr>
+          <w:p>
+            <w:r>
+              <w:t>Community Incident Verification</w:t>
+            </w:r>
+          </w:p>
+        </w:tc>
+        <w:tc>
+          <w:tcPr>
+            <w:tcW w:type="dxa" w:w="2160"/>
+          </w:tcPr>
+          <w:p>
+            <w:r>
+              <w:t>Closed / Proprietary</w:t>
+            </w:r>
+          </w:p>
+        </w:tc>
+        <w:tc>
+          <w:tcPr>
+            <w:tcW w:type="dxa" w:w="2160"/>
+          </w:tcPr>
+          <w:p>
+            <w:r>
+              <w:t>No community reporting</w:t>
+            </w:r>
+          </w:p>
+        </w:tc>
+        <w:tc>
+          <w:tcPr>
+            <w:tcW w:type="dxa" w:w="2160"/>
+          </w:tcPr>
+          <w:p>
+            <w:r>
+              <w:t>Yes — 2-vote consensus + speed-drop (&gt;30%)</w:t>
+            </w:r>
+          </w:p>
+        </w:tc>
+      </w:tr>
+      <w:tr>
+        <w:tc>
+          <w:tcPr>
+            <w:tcW w:type="dxa" w:w="2160"/>
+          </w:tcPr>
+          <w:p>
+            <w:r>
+              <w:t>Google Maps Corridor Handoff</w:t>
+            </w:r>
+          </w:p>
+        </w:tc>
+        <w:tc>
+          <w:tcPr>
+            <w:tcW w:type="dxa" w:w="2160"/>
+          </w:tcPr>
+          <w:p>
+            <w:r>
+              <w:t>N/A</w:t>
+            </w:r>
+          </w:p>
+        </w:tc>
+        <w:tc>
+          <w:tcPr>
+            <w:tcW w:type="dxa" w:w="2160"/>
+          </w:tcPr>
+          <w:p>
+            <w:r>
+              <w:t>N/A</w:t>
+            </w:r>
+          </w:p>
+        </w:tc>
+        <w:tc>
+          <w:tcPr>
+            <w:tcW w:type="dxa" w:w="2160"/>
+          </w:tcPr>
+          <w:p>
+            <w:r>
+              <w:t>Yes — Decision-anchor waypoints preserve corridor</w:t>
             </w:r>
           </w:p>
         </w:tc>
@@ -580,66 +612,7 @@
           </w:p>
         </w:tc>
       </w:tr>
-      <w:tr>
-        <w:tc>
-          <w:tcPr>
-            <w:tcW w:type="dxa" w:w="2160"/>
-          </w:tcPr>
-          <w:p>
-            <w:r>
-              <w:t>Side-by-Side Comparison Matrix</w:t>
-            </w:r>
-          </w:p>
-        </w:tc>
-        <w:tc>
-          <w:tcPr>
-            <w:tcW w:type="dxa" w:w="2160"/>
-          </w:tcPr>
-          <w:p>
-            <w:r>
-              <w:t>No (Must switch back &amp; forth)</w:t>
-            </w:r>
-          </w:p>
-        </w:tc>
-        <w:tc>
-          <w:tcPr>
-            <w:tcW w:type="dxa" w:w="2160"/>
-          </w:tcPr>
-          <w:p>
-            <w:r>
-              <w:t>No (Single route view)</w:t>
-            </w:r>
-          </w:p>
-        </w:tc>
-        <w:tc>
-          <w:tcPr>
-            <w:tcW w:type="dxa" w:w="2160"/>
-          </w:tcPr>
-          <w:p>
-            <w:r>
-              <w:t>Yes — Simultaneous comparison table</w:t>
-            </w:r>
-          </w:p>
-        </w:tc>
-      </w:tr>
     </w:tbl>
-    <w:p>
-      <w:pPr>
-        <w:pStyle w:val="Heading3"/>
-      </w:pPr>
-      <w:r>
-        <w:t>4.3 Top 3 Takeaways to Explain to Judges</w:t>
-      </w:r>
-    </w:p>
-    <w:p>
-      <w:r>
-        <w:t>1. Not Just Another Map: We don't reinvent map tiles; we solve the intelligence layer that evaluates multiple alternatives and tells you why Route #1 is the best.</w:t>
-        <w:br/>
-        <w:t>2. Tangible Commuter ROI: Saving 15 minutes of junction delay per trip directly reduces fuel consumption, vehicle wear, late penalties, and driver burnout.</w:t>
-        <w:br/>
-        <w:t>3. Production-Ready Tech: Powered by TomTom live traffic, public ARIMA (1,0,1) ML forecasting, resilient fail-safes, and 40 automated tests passed at 100%.</w:t>
-      </w:r>
-    </w:p>
     <w:sectPr>
       <w:pgSz w:w="12240" w:h="15840"/>
       <w:pgMar w:top="1440" w:right="1800" w:bottom="1440" w:left="1800" w:header="720" w:footer="720" w:gutter="0"/>

</xml_diff>